<commit_message>
nmv 13 06 2026
</commit_message>
<xml_diff>
--- a/TS-Kramam/TS-2.5/TS 2.5 Malayalam Krama Paatam Corrections.docx
+++ b/TS-Kramam/TS-2.5/TS 2.5 Malayalam Krama Paatam Corrections.docx
@@ -21,7 +21,29 @@
           <w:szCs w:val="32"/>
           <w:u w:val="single"/>
         </w:rPr>
-        <w:t xml:space="preserve">TS Krama Paatam – TS 2.5 Malayalam  Corrections – Observed till </w:t>
+        <w:t xml:space="preserve">TS Krama Paatam – TS 2.5 </w:t>
+      </w:r>
+      <w:proofErr w:type="gramStart"/>
+      <w:r>
+        <w:rPr>
+          <w:b/>
+          <w:bCs/>
+          <w:sz w:val="32"/>
+          <w:szCs w:val="32"/>
+          <w:u w:val="single"/>
+        </w:rPr>
+        <w:t>Malayalam  Corrections</w:t>
+      </w:r>
+      <w:proofErr w:type="gramEnd"/>
+      <w:r>
+        <w:rPr>
+          <w:b/>
+          <w:bCs/>
+          <w:sz w:val="32"/>
+          <w:szCs w:val="32"/>
+          <w:u w:val="single"/>
+        </w:rPr>
+        <w:t xml:space="preserve"> – Observed till </w:t>
       </w:r>
       <w:r>
         <w:rPr>
@@ -2327,15 +2349,15 @@
                 <w:rFonts w:ascii="BRH Malayalam Extra" w:hAnsi="BRH Malayalam Extra" w:cs="BRH Malayalam Extra"/>
                 <w:sz w:val="40"/>
                 <w:szCs w:val="40"/>
-                <w:lang w:val="en-IN"/>
-              </w:rPr>
-            </w:pPr>
-            <w:r>
-              <w:rPr>
-                <w:rFonts w:ascii="BRH Malayalam Extra" w:hAnsi="BRH Malayalam Extra" w:cs="BRH Malayalam Extra"/>
-                <w:sz w:val="40"/>
-                <w:szCs w:val="40"/>
-                <w:lang w:val="en-IN"/>
+                <w:lang w:val="it-IT"/>
+              </w:rPr>
+            </w:pPr>
+            <w:r>
+              <w:rPr>
+                <w:rFonts w:ascii="BRH Malayalam Extra" w:hAnsi="BRH Malayalam Extra" w:cs="BRH Malayalam Extra"/>
+                <w:sz w:val="40"/>
+                <w:szCs w:val="40"/>
+                <w:lang w:val="it-IT"/>
               </w:rPr>
               <w:t>A</w:t>
             </w:r>
@@ -2344,7 +2366,7 @@
                 <w:rFonts w:ascii="BRH Malayalam Extra" w:hAnsi="BRH Malayalam Extra" w:cs="BRH Malayalam Extra"/>
                 <w:sz w:val="33"/>
                 <w:szCs w:val="40"/>
-                <w:lang w:val="en-IN"/>
+                <w:lang w:val="it-IT"/>
               </w:rPr>
               <w:t>–</w:t>
             </w:r>
@@ -2354,7 +2376,7 @@
                 <w:sz w:val="40"/>
                 <w:szCs w:val="40"/>
                 <w:highlight w:val="green"/>
-                <w:lang w:val="en-IN"/>
+                <w:lang w:val="it-IT"/>
               </w:rPr>
               <w:t>r</w:t>
             </w:r>
@@ -2363,7 +2385,7 @@
                 <w:rFonts w:ascii="BRH Malayalam Extra" w:hAnsi="BRH Malayalam Extra" w:cs="BRH Malayalam Extra"/>
                 <w:sz w:val="40"/>
                 <w:szCs w:val="40"/>
-                <w:lang w:val="en-IN"/>
+                <w:lang w:val="it-IT"/>
               </w:rPr>
               <w:t>æxKexm</w:t>
             </w:r>
@@ -2372,16 +2394,16 @@
                 <w:rFonts w:ascii="BRH Malayalam Extra" w:hAnsi="BRH Malayalam Extra" w:cs="BRH Malayalam Extra"/>
                 <w:sz w:val="33"/>
                 <w:szCs w:val="40"/>
-                <w:lang w:val="en-IN"/>
-              </w:rPr>
-              <w:t>–</w:t>
-            </w:r>
-            <w:r>
-              <w:rPr>
-                <w:rFonts w:ascii="BRH Malayalam Extra" w:hAnsi="BRH Malayalam Extra" w:cs="BRH Malayalam Extra"/>
-                <w:sz w:val="40"/>
-                <w:szCs w:val="40"/>
-                <w:lang w:val="en-IN"/>
+                <w:lang w:val="it-IT"/>
+              </w:rPr>
+              <w:t>–</w:t>
+            </w:r>
+            <w:r>
+              <w:rPr>
+                <w:rFonts w:ascii="BRH Malayalam Extra" w:hAnsi="BRH Malayalam Extra" w:cs="BRH Malayalam Extra"/>
+                <w:sz w:val="40"/>
+                <w:szCs w:val="40"/>
+                <w:lang w:val="it-IT"/>
               </w:rPr>
               <w:t>iyZõ</w:t>
             </w:r>
@@ -2390,16 +2412,16 @@
                 <w:rFonts w:ascii="BRH Malayalam Extra" w:hAnsi="BRH Malayalam Extra" w:cs="BRH Malayalam Extra"/>
                 <w:sz w:val="33"/>
                 <w:szCs w:val="40"/>
-                <w:lang w:val="en-IN"/>
-              </w:rPr>
-              <w:t>–</w:t>
-            </w:r>
-            <w:r>
-              <w:rPr>
-                <w:rFonts w:ascii="BRH Malayalam Extra" w:hAnsi="BRH Malayalam Extra" w:cs="BRH Malayalam Extra"/>
-                <w:sz w:val="40"/>
-                <w:szCs w:val="40"/>
-                <w:lang w:val="en-IN"/>
+                <w:lang w:val="it-IT"/>
+              </w:rPr>
+              <w:t>–</w:t>
+            </w:r>
+            <w:r>
+              <w:rPr>
+                <w:rFonts w:ascii="BRH Malayalam Extra" w:hAnsi="BRH Malayalam Extra" w:cs="BRH Malayalam Extra"/>
+                <w:sz w:val="40"/>
+                <w:szCs w:val="40"/>
+                <w:lang w:val="it-IT"/>
               </w:rPr>
               <w:t xml:space="preserve">ræx - </w:t>
             </w:r>
@@ -2541,27 +2563,7 @@
                 <w:szCs w:val="32"/>
                 <w:lang w:bidi="ta-IN"/>
               </w:rPr>
-              <w:t>.</w:t>
-            </w:r>
-            <w:r>
-              <w:rPr>
-                <w:rFonts w:cs="Arial"/>
-                <w:b/>
-                <w:sz w:val="28"/>
-                <w:szCs w:val="32"/>
-                <w:lang w:bidi="ta-IN"/>
-              </w:rPr>
-              <w:t>4</w:t>
-            </w:r>
-            <w:r>
-              <w:rPr>
-                <w:rFonts w:cs="Arial"/>
-                <w:b/>
-                <w:sz w:val="28"/>
-                <w:szCs w:val="32"/>
-                <w:lang w:bidi="ta-IN"/>
-              </w:rPr>
-              <w:t>– Kramam</w:t>
+              <w:t>.4– Kramam</w:t>
             </w:r>
           </w:p>
           <w:p>
@@ -2580,28 +2582,18 @@
                 <w:b/>
                 <w:sz w:val="28"/>
                 <w:szCs w:val="32"/>
-                <w:lang w:val="it-IT" w:bidi="ta-IN"/>
-              </w:rPr>
-            </w:pPr>
-            <w:r>
-              <w:rPr>
-                <w:rFonts w:cs="Arial"/>
-                <w:b/>
-                <w:sz w:val="28"/>
-                <w:szCs w:val="32"/>
-                <w:lang w:val="it-IT" w:bidi="ta-IN"/>
-              </w:rPr>
-              <w:t xml:space="preserve">Krama Vaakyam No. - </w:t>
-            </w:r>
-            <w:r>
-              <w:rPr>
-                <w:rFonts w:cs="Arial"/>
-                <w:b/>
-                <w:sz w:val="28"/>
-                <w:szCs w:val="32"/>
-                <w:lang w:val="it-IT" w:bidi="ta-IN"/>
-              </w:rPr>
-              <w:t>22</w:t>
+                <w:lang w:val="en-IN" w:bidi="ta-IN"/>
+              </w:rPr>
+            </w:pPr>
+            <w:r>
+              <w:rPr>
+                <w:rFonts w:cs="Arial"/>
+                <w:b/>
+                <w:sz w:val="28"/>
+                <w:szCs w:val="32"/>
+                <w:lang w:val="en-IN" w:bidi="ta-IN"/>
+              </w:rPr>
+              <w:t>Krama Vaakyam No. - 22</w:t>
             </w:r>
           </w:p>
           <w:p>
@@ -2675,13 +2667,15 @@
                 <w:rFonts w:ascii="BRH Malayalam Extra" w:hAnsi="BRH Malayalam Extra" w:cs="BRH Malayalam Extra"/>
                 <w:sz w:val="40"/>
                 <w:szCs w:val="40"/>
-              </w:rPr>
-            </w:pPr>
-            <w:r>
-              <w:rPr>
-                <w:rFonts w:ascii="BRH Malayalam Extra" w:hAnsi="BRH Malayalam Extra" w:cs="BRH Malayalam Extra"/>
-                <w:sz w:val="40"/>
-                <w:szCs w:val="40"/>
+                <w:lang w:val="it-IT"/>
+              </w:rPr>
+            </w:pPr>
+            <w:r>
+              <w:rPr>
+                <w:rFonts w:ascii="BRH Malayalam Extra" w:hAnsi="BRH Malayalam Extra" w:cs="BRH Malayalam Extra"/>
+                <w:sz w:val="40"/>
+                <w:szCs w:val="40"/>
+                <w:lang w:val="it-IT"/>
               </w:rPr>
               <w:t>e</w:t>
             </w:r>
@@ -2690,14 +2684,16 @@
                 <w:rFonts w:ascii="BRH Malayalam Extra" w:hAnsi="BRH Malayalam Extra" w:cs="BRH Malayalam Extra"/>
                 <w:sz w:val="33"/>
                 <w:szCs w:val="40"/>
-              </w:rPr>
-              <w:t>–</w:t>
-            </w:r>
-            <w:r>
-              <w:rPr>
-                <w:rFonts w:ascii="BRH Malayalam Extra" w:hAnsi="BRH Malayalam Extra" w:cs="BRH Malayalam Extra"/>
-                <w:sz w:val="40"/>
-                <w:szCs w:val="40"/>
+                <w:lang w:val="it-IT"/>
+              </w:rPr>
+              <w:t>–</w:t>
+            </w:r>
+            <w:r>
+              <w:rPr>
+                <w:rFonts w:ascii="BRH Malayalam Extra" w:hAnsi="BRH Malayalam Extra" w:cs="BRH Malayalam Extra"/>
+                <w:sz w:val="40"/>
+                <w:szCs w:val="40"/>
+                <w:lang w:val="it-IT"/>
               </w:rPr>
               <w:t>Òx¶</w:t>
             </w:r>
@@ -2706,6 +2702,7 @@
                 <w:rFonts w:ascii="BRH Malayalam Extra" w:hAnsi="BRH Malayalam Extra" w:cs="BRH Malayalam Extra"/>
                 <w:sz w:val="33"/>
                 <w:szCs w:val="40"/>
+                <w:lang w:val="it-IT"/>
               </w:rPr>
               <w:t>–</w:t>
             </w:r>
@@ -2715,6 +2712,7 @@
                 <w:sz w:val="40"/>
                 <w:szCs w:val="40"/>
                 <w:highlight w:val="yellow"/>
+                <w:lang w:val="it-IT"/>
               </w:rPr>
               <w:t>É</w:t>
             </w:r>
@@ -2723,6 +2721,7 @@
                 <w:rFonts w:ascii="BRH Malayalam Extra" w:hAnsi="BRH Malayalam Extra" w:cs="BRH Malayalam Extra"/>
                 <w:sz w:val="40"/>
                 <w:szCs w:val="40"/>
+                <w:lang w:val="it-IT"/>
               </w:rPr>
               <w:t>ix˜J | P</w:t>
             </w:r>
@@ -2731,14 +2730,16 @@
                 <w:rFonts w:ascii="BRH Malayalam Extra" w:hAnsi="BRH Malayalam Extra" w:cs="BRH Malayalam Extra"/>
                 <w:sz w:val="33"/>
                 <w:szCs w:val="40"/>
-              </w:rPr>
-              <w:t>–</w:t>
-            </w:r>
-            <w:r>
-              <w:rPr>
-                <w:rFonts w:ascii="BRH Malayalam Extra" w:hAnsi="BRH Malayalam Extra" w:cs="BRH Malayalam Extra"/>
-                <w:sz w:val="40"/>
-                <w:szCs w:val="40"/>
+                <w:lang w:val="it-IT"/>
+              </w:rPr>
+              <w:t>–</w:t>
+            </w:r>
+            <w:r>
+              <w:rPr>
+                <w:rFonts w:ascii="BRH Malayalam Extra" w:hAnsi="BRH Malayalam Extra" w:cs="BRH Malayalam Extra"/>
+                <w:sz w:val="40"/>
+                <w:szCs w:val="40"/>
+                <w:lang w:val="it-IT"/>
               </w:rPr>
               <w:t>öÉix— A</w:t>
             </w:r>
@@ -2747,14 +2748,16 @@
                 <w:rFonts w:ascii="BRH Malayalam Extra" w:hAnsi="BRH Malayalam Extra" w:cs="BRH Malayalam Extra"/>
                 <w:sz w:val="33"/>
                 <w:szCs w:val="40"/>
-              </w:rPr>
-              <w:t>–</w:t>
-            </w:r>
-            <w:r>
-              <w:rPr>
-                <w:rFonts w:ascii="BRH Malayalam Extra" w:hAnsi="BRH Malayalam Extra" w:cs="BRH Malayalam Extra"/>
-                <w:sz w:val="40"/>
-                <w:szCs w:val="40"/>
+                <w:lang w:val="it-IT"/>
+              </w:rPr>
+              <w:t>–</w:t>
+            </w:r>
+            <w:r>
+              <w:rPr>
+                <w:rFonts w:ascii="BRH Malayalam Extra" w:hAnsi="BRH Malayalam Extra" w:cs="BRH Malayalam Extra"/>
+                <w:sz w:val="40"/>
+                <w:szCs w:val="40"/>
+                <w:lang w:val="it-IT"/>
               </w:rPr>
               <w:t>hy |</w:t>
             </w:r>
@@ -2781,13 +2784,15 @@
                 <w:rFonts w:ascii="BRH Malayalam Extra" w:hAnsi="BRH Malayalam Extra" w:cs="BRH Malayalam Extra"/>
                 <w:sz w:val="40"/>
                 <w:szCs w:val="40"/>
-              </w:rPr>
-            </w:pPr>
-            <w:r>
-              <w:rPr>
-                <w:rFonts w:ascii="BRH Malayalam Extra" w:hAnsi="BRH Malayalam Extra" w:cs="BRH Malayalam Extra"/>
-                <w:sz w:val="40"/>
-                <w:szCs w:val="40"/>
+                <w:lang w:val="it-IT"/>
+              </w:rPr>
+            </w:pPr>
+            <w:r>
+              <w:rPr>
+                <w:rFonts w:ascii="BRH Malayalam Extra" w:hAnsi="BRH Malayalam Extra" w:cs="BRH Malayalam Extra"/>
+                <w:sz w:val="40"/>
+                <w:szCs w:val="40"/>
+                <w:lang w:val="it-IT"/>
               </w:rPr>
               <w:t>e</w:t>
             </w:r>
@@ -2796,14 +2801,16 @@
                 <w:rFonts w:ascii="BRH Malayalam Extra" w:hAnsi="BRH Malayalam Extra" w:cs="BRH Malayalam Extra"/>
                 <w:sz w:val="33"/>
                 <w:szCs w:val="40"/>
-              </w:rPr>
-              <w:t>–</w:t>
-            </w:r>
-            <w:r>
-              <w:rPr>
-                <w:rFonts w:ascii="BRH Malayalam Extra" w:hAnsi="BRH Malayalam Extra" w:cs="BRH Malayalam Extra"/>
-                <w:sz w:val="40"/>
-                <w:szCs w:val="40"/>
+                <w:lang w:val="it-IT"/>
+              </w:rPr>
+              <w:t>–</w:t>
+            </w:r>
+            <w:r>
+              <w:rPr>
+                <w:rFonts w:ascii="BRH Malayalam Extra" w:hAnsi="BRH Malayalam Extra" w:cs="BRH Malayalam Extra"/>
+                <w:sz w:val="40"/>
+                <w:szCs w:val="40"/>
+                <w:lang w:val="it-IT"/>
               </w:rPr>
               <w:t>Òx¶</w:t>
             </w:r>
@@ -2812,6 +2819,7 @@
                 <w:rFonts w:ascii="BRH Malayalam Extra" w:hAnsi="BRH Malayalam Extra" w:cs="BRH Malayalam Extra"/>
                 <w:sz w:val="33"/>
                 <w:szCs w:val="40"/>
+                <w:lang w:val="it-IT"/>
               </w:rPr>
               <w:t>––</w:t>
             </w:r>
@@ -2821,6 +2829,7 @@
                 <w:sz w:val="40"/>
                 <w:szCs w:val="40"/>
                 <w:highlight w:val="green"/>
+                <w:lang w:val="it-IT"/>
               </w:rPr>
               <w:t>ö</w:t>
             </w:r>
@@ -2829,6 +2838,7 @@
                 <w:rFonts w:ascii="BRH Malayalam Extra" w:hAnsi="BRH Malayalam Extra" w:cs="BRH Malayalam Extra"/>
                 <w:sz w:val="40"/>
                 <w:szCs w:val="40"/>
+                <w:lang w:val="it-IT"/>
               </w:rPr>
               <w:t>Éix˜J | P</w:t>
             </w:r>
@@ -2837,14 +2847,16 @@
                 <w:rFonts w:ascii="BRH Malayalam Extra" w:hAnsi="BRH Malayalam Extra" w:cs="BRH Malayalam Extra"/>
                 <w:sz w:val="33"/>
                 <w:szCs w:val="40"/>
-              </w:rPr>
-              <w:t>–</w:t>
-            </w:r>
-            <w:r>
-              <w:rPr>
-                <w:rFonts w:ascii="BRH Malayalam Extra" w:hAnsi="BRH Malayalam Extra" w:cs="BRH Malayalam Extra"/>
-                <w:sz w:val="40"/>
-                <w:szCs w:val="40"/>
+                <w:lang w:val="it-IT"/>
+              </w:rPr>
+              <w:t>–</w:t>
+            </w:r>
+            <w:r>
+              <w:rPr>
+                <w:rFonts w:ascii="BRH Malayalam Extra" w:hAnsi="BRH Malayalam Extra" w:cs="BRH Malayalam Extra"/>
+                <w:sz w:val="40"/>
+                <w:szCs w:val="40"/>
+                <w:lang w:val="it-IT"/>
               </w:rPr>
               <w:t>öÉix— A</w:t>
             </w:r>
@@ -2853,14 +2865,16 @@
                 <w:rFonts w:ascii="BRH Malayalam Extra" w:hAnsi="BRH Malayalam Extra" w:cs="BRH Malayalam Extra"/>
                 <w:sz w:val="33"/>
                 <w:szCs w:val="40"/>
-              </w:rPr>
-              <w:t>–</w:t>
-            </w:r>
-            <w:r>
-              <w:rPr>
-                <w:rFonts w:ascii="BRH Malayalam Extra" w:hAnsi="BRH Malayalam Extra" w:cs="BRH Malayalam Extra"/>
-                <w:sz w:val="40"/>
-                <w:szCs w:val="40"/>
+                <w:lang w:val="it-IT"/>
+              </w:rPr>
+              <w:t>–</w:t>
+            </w:r>
+            <w:r>
+              <w:rPr>
+                <w:rFonts w:ascii="BRH Malayalam Extra" w:hAnsi="BRH Malayalam Extra" w:cs="BRH Malayalam Extra"/>
+                <w:sz w:val="40"/>
+                <w:szCs w:val="40"/>
+                <w:lang w:val="it-IT"/>
               </w:rPr>
               <w:t>hy |</w:t>
             </w:r>
@@ -3388,13 +3402,23 @@
               </w:rPr>
               <w:t>–</w:t>
             </w:r>
-            <w:r>
-              <w:rPr>
-                <w:rFonts w:ascii="BRH Malayalam Extra" w:hAnsi="BRH Malayalam Extra" w:cs="BRH Malayalam Extra"/>
-                <w:sz w:val="40"/>
-                <w:szCs w:val="40"/>
-              </w:rPr>
-              <w:t>ª.r—jJ |</w:t>
+            <w:proofErr w:type="gramStart"/>
+            <w:r>
+              <w:rPr>
+                <w:rFonts w:ascii="BRH Malayalam Extra" w:hAnsi="BRH Malayalam Extra" w:cs="BRH Malayalam Extra"/>
+                <w:sz w:val="40"/>
+                <w:szCs w:val="40"/>
+              </w:rPr>
+              <w:t>ª.r</w:t>
+            </w:r>
+            <w:proofErr w:type="gramEnd"/>
+            <w:r>
+              <w:rPr>
+                <w:rFonts w:ascii="BRH Malayalam Extra" w:hAnsi="BRH Malayalam Extra" w:cs="BRH Malayalam Extra"/>
+                <w:sz w:val="40"/>
+                <w:szCs w:val="40"/>
+              </w:rPr>
+              <w:t>—jJ |</w:t>
             </w:r>
           </w:p>
         </w:tc>
@@ -3437,6 +3461,7 @@
               </w:rPr>
               <w:t>–</w:t>
             </w:r>
+            <w:proofErr w:type="gramStart"/>
             <w:r>
               <w:rPr>
                 <w:rFonts w:ascii="BRH Malayalam Extra" w:hAnsi="BRH Malayalam Extra" w:cs="BRH Malayalam Extra"/>
@@ -3452,7 +3477,16 @@
                 <w:sz w:val="40"/>
                 <w:szCs w:val="40"/>
               </w:rPr>
-              <w:t>ª.r—jJ |</w:t>
+              <w:t>ª.r</w:t>
+            </w:r>
+            <w:proofErr w:type="gramEnd"/>
+            <w:r>
+              <w:rPr>
+                <w:rFonts w:ascii="BRH Malayalam Extra" w:hAnsi="BRH Malayalam Extra" w:cs="BRH Malayalam Extra"/>
+                <w:sz w:val="40"/>
+                <w:szCs w:val="40"/>
+              </w:rPr>
+              <w:t>—jJ |</w:t>
             </w:r>
           </w:p>
         </w:tc>
@@ -3885,6 +3919,402 @@
                 <w:b/>
                 <w:sz w:val="28"/>
                 <w:szCs w:val="32"/>
+                <w:lang w:val="it-IT" w:bidi="ta-IN"/>
+              </w:rPr>
+            </w:pPr>
+            <w:r>
+              <w:rPr>
+                <w:rFonts w:cs="Arial"/>
+                <w:b/>
+                <w:sz w:val="28"/>
+                <w:szCs w:val="32"/>
+                <w:lang w:val="it-IT" w:bidi="ta-IN"/>
+              </w:rPr>
+              <w:t>T.S.2.5.11.</w:t>
+            </w:r>
+            <w:r>
+              <w:rPr>
+                <w:rFonts w:cs="Arial"/>
+                <w:b/>
+                <w:sz w:val="28"/>
+                <w:szCs w:val="32"/>
+                <w:lang w:val="it-IT" w:bidi="ta-IN"/>
+              </w:rPr>
+              <w:t>5</w:t>
+            </w:r>
+            <w:r>
+              <w:rPr>
+                <w:rFonts w:cs="Arial"/>
+                <w:b/>
+                <w:sz w:val="28"/>
+                <w:szCs w:val="32"/>
+                <w:lang w:val="it-IT" w:bidi="ta-IN"/>
+              </w:rPr>
+              <w:t xml:space="preserve"> Kramam</w:t>
+            </w:r>
+          </w:p>
+          <w:p>
+            <w:pPr>
+              <w:widowControl w:val="0"/>
+              <w:tabs>
+                <w:tab w:val="left" w:pos="993"/>
+              </w:tabs>
+              <w:autoSpaceDE w:val="0"/>
+              <w:autoSpaceDN w:val="0"/>
+              <w:adjustRightInd w:val="0"/>
+              <w:spacing w:before="0" w:line="240" w:lineRule="auto"/>
+              <w:ind w:right="297"/>
+              <w:rPr>
+                <w:rFonts w:cs="Arial"/>
+                <w:b/>
+                <w:szCs w:val="28"/>
+                <w:lang w:val="it-IT" w:bidi="ta-IN"/>
+              </w:rPr>
+            </w:pPr>
+            <w:r>
+              <w:rPr>
+                <w:rFonts w:cs="Arial"/>
+                <w:b/>
+                <w:szCs w:val="28"/>
+                <w:lang w:val="it-IT" w:bidi="ta-IN"/>
+              </w:rPr>
+              <w:t xml:space="preserve">Krama Vaakyam No. – </w:t>
+            </w:r>
+            <w:r>
+              <w:rPr>
+                <w:rFonts w:cs="Arial"/>
+                <w:b/>
+                <w:szCs w:val="28"/>
+                <w:lang w:val="it-IT" w:bidi="ta-IN"/>
+              </w:rPr>
+              <w:t>13</w:t>
+            </w:r>
+            <w:r>
+              <w:rPr>
+                <w:rFonts w:cs="Arial"/>
+                <w:b/>
+                <w:szCs w:val="28"/>
+                <w:lang w:val="it-IT" w:bidi="ta-IN"/>
+              </w:rPr>
+              <w:t>,14</w:t>
+            </w:r>
+          </w:p>
+          <w:p>
+            <w:pPr>
+              <w:widowControl w:val="0"/>
+              <w:tabs>
+                <w:tab w:val="left" w:pos="993"/>
+              </w:tabs>
+              <w:autoSpaceDE w:val="0"/>
+              <w:autoSpaceDN w:val="0"/>
+              <w:adjustRightInd w:val="0"/>
+              <w:spacing w:before="0" w:line="240" w:lineRule="auto"/>
+              <w:ind w:right="297"/>
+              <w:rPr>
+                <w:rFonts w:cs="Arial"/>
+                <w:b/>
+                <w:sz w:val="28"/>
+                <w:szCs w:val="32"/>
+                <w:lang w:val="it-IT" w:bidi="ta-IN"/>
+              </w:rPr>
+            </w:pPr>
+            <w:r>
+              <w:rPr>
+                <w:rFonts w:cs="Arial"/>
+                <w:b/>
+                <w:sz w:val="28"/>
+                <w:szCs w:val="32"/>
+                <w:lang w:val="it-IT" w:bidi="ta-IN"/>
+              </w:rPr>
+              <w:t>Panchaati No</w:t>
+            </w:r>
+            <w:r>
+              <w:rPr>
+                <w:rFonts w:cs="Arial"/>
+                <w:b/>
+                <w:szCs w:val="32"/>
+                <w:lang w:val="it-IT" w:bidi="ta-IN"/>
+              </w:rPr>
+              <w:t>. -</w:t>
+            </w:r>
+            <w:r>
+              <w:rPr>
+                <w:rFonts w:cs="Arial"/>
+                <w:b/>
+                <w:sz w:val="28"/>
+                <w:szCs w:val="28"/>
+                <w:lang w:val="it-IT" w:bidi="ta-IN"/>
+              </w:rPr>
+              <w:t xml:space="preserve"> 6</w:t>
+            </w:r>
+            <w:r>
+              <w:rPr>
+                <w:rFonts w:cs="Arial"/>
+                <w:b/>
+                <w:sz w:val="28"/>
+                <w:szCs w:val="28"/>
+                <w:lang w:val="it-IT" w:bidi="ta-IN"/>
+              </w:rPr>
+              <w:t>5</w:t>
+            </w:r>
+          </w:p>
+        </w:tc>
+        <w:tc>
+          <w:tcPr>
+            <w:tcW w:w="5132" w:type="dxa"/>
+            <w:tcBorders>
+              <w:top w:val="single" w:sz="4" w:space="0" w:color="000000"/>
+              <w:left w:val="single" w:sz="4" w:space="0" w:color="000000"/>
+              <w:bottom w:val="single" w:sz="4" w:space="0" w:color="000000"/>
+              <w:right w:val="single" w:sz="4" w:space="0" w:color="000000"/>
+            </w:tcBorders>
+          </w:tcPr>
+          <w:p>
+            <w:pPr>
+              <w:widowControl w:val="0"/>
+              <w:autoSpaceDE w:val="0"/>
+              <w:autoSpaceDN w:val="0"/>
+              <w:adjustRightInd w:val="0"/>
+              <w:spacing w:before="0" w:line="240" w:lineRule="auto"/>
+              <w:rPr>
+                <w:rFonts w:ascii="BRH Malayalam Extra" w:hAnsi="BRH Malayalam Extra" w:cs="BRH Malayalam Extra"/>
+                <w:sz w:val="40"/>
+                <w:szCs w:val="40"/>
+              </w:rPr>
+            </w:pPr>
+            <w:r>
+              <w:rPr>
+                <w:rFonts w:ascii="BRH Malayalam Extra" w:hAnsi="BRH Malayalam Extra" w:cs="BRH Malayalam Extra"/>
+                <w:color w:val="000000"/>
+                <w:sz w:val="40"/>
+                <w:szCs w:val="40"/>
+              </w:rPr>
+              <w:t>px</w:t>
+            </w:r>
+            <w:r>
+              <w:rPr>
+                <w:rFonts w:ascii="BRH Malayalam Extra" w:hAnsi="BRH Malayalam Extra" w:cs="BRH Malayalam Extra"/>
+                <w:color w:val="000000"/>
+                <w:sz w:val="33"/>
+                <w:szCs w:val="40"/>
+              </w:rPr>
+              <w:t>–</w:t>
+            </w:r>
+            <w:r>
+              <w:rPr>
+                <w:rFonts w:ascii="BRH Malayalam Extra" w:hAnsi="BRH Malayalam Extra" w:cs="BRH Malayalam Extra"/>
+                <w:color w:val="000000"/>
+                <w:sz w:val="40"/>
+                <w:szCs w:val="40"/>
+              </w:rPr>
+              <w:t xml:space="preserve">Px </w:t>
+            </w:r>
+            <w:r>
+              <w:rPr>
+                <w:rFonts w:ascii="BRH Malayalam Extra" w:hAnsi="BRH Malayalam Extra" w:cs="BRH Malayalam Extra"/>
+                <w:color w:val="000000"/>
+                <w:sz w:val="40"/>
+                <w:szCs w:val="40"/>
+                <w:highlight w:val="yellow"/>
+              </w:rPr>
+              <w:t>p—b</w:t>
+            </w:r>
+            <w:r>
+              <w:rPr>
+                <w:rFonts w:ascii="BRH Malayalam Extra" w:hAnsi="BRH Malayalam Extra" w:cs="BRH Malayalam Extra"/>
+                <w:color w:val="000000"/>
+                <w:sz w:val="40"/>
+                <w:szCs w:val="40"/>
+              </w:rPr>
+              <w:t xml:space="preserve">Zy | </w:t>
+            </w:r>
+            <w:r>
+              <w:rPr>
+                <w:rFonts w:ascii="BRH Malayalam Extra" w:hAnsi="BRH Malayalam Extra" w:cs="BRH Malayalam Extra"/>
+                <w:color w:val="000000"/>
+                <w:sz w:val="40"/>
+                <w:szCs w:val="40"/>
+                <w:highlight w:val="yellow"/>
+              </w:rPr>
+              <w:t>p</w:t>
+            </w:r>
+            <w:r>
+              <w:rPr>
+                <w:rFonts w:ascii="BRH Malayalam Extra" w:hAnsi="BRH Malayalam Extra" w:cs="BRH Malayalam Extra"/>
+                <w:color w:val="000000"/>
+                <w:sz w:val="33"/>
+                <w:szCs w:val="40"/>
+              </w:rPr>
+              <w:t>–</w:t>
+            </w:r>
+            <w:r>
+              <w:rPr>
+                <w:rFonts w:ascii="BRH Malayalam Extra" w:hAnsi="BRH Malayalam Extra" w:cs="BRH Malayalam Extra"/>
+                <w:color w:val="000000"/>
+                <w:sz w:val="40"/>
+                <w:szCs w:val="40"/>
+              </w:rPr>
+              <w:t>b</w:t>
+            </w:r>
+            <w:r>
+              <w:rPr>
+                <w:rFonts w:ascii="BRH Malayalam Extra" w:hAnsi="BRH Malayalam Extra" w:cs="BRH Malayalam Extra"/>
+                <w:color w:val="000000"/>
+                <w:sz w:val="33"/>
+                <w:szCs w:val="40"/>
+              </w:rPr>
+              <w:t>–</w:t>
+            </w:r>
+            <w:r>
+              <w:rPr>
+                <w:rFonts w:ascii="BRH Malayalam Extra" w:hAnsi="BRH Malayalam Extra" w:cs="BRH Malayalam Extra"/>
+                <w:color w:val="000000"/>
+                <w:sz w:val="40"/>
+                <w:szCs w:val="40"/>
+              </w:rPr>
+              <w:t>ZzZy— |</w:t>
+            </w:r>
+          </w:p>
+        </w:tc>
+        <w:tc>
+          <w:tcPr>
+            <w:tcW w:w="5528" w:type="dxa"/>
+            <w:tcBorders>
+              <w:top w:val="single" w:sz="4" w:space="0" w:color="000000"/>
+              <w:left w:val="single" w:sz="4" w:space="0" w:color="000000"/>
+              <w:bottom w:val="single" w:sz="4" w:space="0" w:color="000000"/>
+              <w:right w:val="single" w:sz="4" w:space="0" w:color="000000"/>
+            </w:tcBorders>
+          </w:tcPr>
+          <w:p>
+            <w:pPr>
+              <w:widowControl w:val="0"/>
+              <w:autoSpaceDE w:val="0"/>
+              <w:autoSpaceDN w:val="0"/>
+              <w:adjustRightInd w:val="0"/>
+              <w:spacing w:before="0" w:line="240" w:lineRule="auto"/>
+              <w:rPr>
+                <w:rFonts w:ascii="BRH Malayalam Extra" w:hAnsi="BRH Malayalam Extra" w:cs="BRH Malayalam Extra"/>
+                <w:sz w:val="40"/>
+                <w:szCs w:val="40"/>
+              </w:rPr>
+            </w:pPr>
+            <w:r>
+              <w:rPr>
+                <w:rFonts w:ascii="BRH Malayalam Extra" w:hAnsi="BRH Malayalam Extra" w:cs="BRH Malayalam Extra"/>
+                <w:color w:val="000000"/>
+                <w:sz w:val="40"/>
+                <w:szCs w:val="40"/>
+              </w:rPr>
+              <w:t>px</w:t>
+            </w:r>
+            <w:r>
+              <w:rPr>
+                <w:rFonts w:ascii="BRH Malayalam Extra" w:hAnsi="BRH Malayalam Extra" w:cs="BRH Malayalam Extra"/>
+                <w:color w:val="000000"/>
+                <w:sz w:val="33"/>
+                <w:szCs w:val="40"/>
+              </w:rPr>
+              <w:t>–</w:t>
+            </w:r>
+            <w:r>
+              <w:rPr>
+                <w:rFonts w:ascii="BRH Malayalam Extra" w:hAnsi="BRH Malayalam Extra" w:cs="BRH Malayalam Extra"/>
+                <w:color w:val="000000"/>
+                <w:sz w:val="40"/>
+                <w:szCs w:val="40"/>
+              </w:rPr>
+              <w:t xml:space="preserve">Px </w:t>
+            </w:r>
+            <w:r>
+              <w:rPr>
+                <w:rFonts w:ascii="BRH Malayalam Extra" w:hAnsi="BRH Malayalam Extra" w:cs="BRH Malayalam Extra"/>
+                <w:color w:val="000000"/>
+                <w:sz w:val="40"/>
+                <w:szCs w:val="40"/>
+                <w:highlight w:val="green"/>
+              </w:rPr>
+              <w:t>pb—</w:t>
+            </w:r>
+            <w:r>
+              <w:rPr>
+                <w:rFonts w:ascii="BRH Malayalam Extra" w:hAnsi="BRH Malayalam Extra" w:cs="BRH Malayalam Extra"/>
+                <w:color w:val="000000"/>
+                <w:sz w:val="40"/>
+                <w:szCs w:val="40"/>
+              </w:rPr>
+              <w:t xml:space="preserve">Zy | </w:t>
+            </w:r>
+            <w:r>
+              <w:rPr>
+                <w:rFonts w:ascii="BRH Malayalam Extra" w:hAnsi="BRH Malayalam Extra" w:cs="BRH Malayalam Extra"/>
+                <w:color w:val="000000"/>
+                <w:sz w:val="40"/>
+                <w:szCs w:val="40"/>
+                <w:highlight w:val="green"/>
+              </w:rPr>
+              <w:t>p</w:t>
+            </w:r>
+            <w:r>
+              <w:rPr>
+                <w:rFonts w:ascii="BRH Malayalam Extra" w:hAnsi="BRH Malayalam Extra" w:cs="BRH Malayalam Extra"/>
+                <w:color w:val="000000"/>
+                <w:sz w:val="40"/>
+                <w:szCs w:val="40"/>
+              </w:rPr>
+              <w:t>b</w:t>
+            </w:r>
+            <w:r>
+              <w:rPr>
+                <w:rFonts w:ascii="BRH Malayalam Extra" w:hAnsi="BRH Malayalam Extra" w:cs="BRH Malayalam Extra"/>
+                <w:color w:val="000000"/>
+                <w:sz w:val="33"/>
+                <w:szCs w:val="40"/>
+              </w:rPr>
+              <w:t>–</w:t>
+            </w:r>
+            <w:r>
+              <w:rPr>
+                <w:rFonts w:ascii="BRH Malayalam Extra" w:hAnsi="BRH Malayalam Extra" w:cs="BRH Malayalam Extra"/>
+                <w:color w:val="000000"/>
+                <w:sz w:val="40"/>
+                <w:szCs w:val="40"/>
+              </w:rPr>
+              <w:t>ZzZy— |</w:t>
+            </w:r>
+          </w:p>
+        </w:tc>
+      </w:tr>
+      <w:tr>
+        <w:trPr>
+          <w:trHeight w:val="980"/>
+        </w:trPr>
+        <w:tc>
+          <w:tcPr>
+            <w:tcW w:w="3877" w:type="dxa"/>
+            <w:tcBorders>
+              <w:top w:val="single" w:sz="4" w:space="0" w:color="000000"/>
+              <w:left w:val="single" w:sz="4" w:space="0" w:color="000000"/>
+              <w:bottom w:val="single" w:sz="4" w:space="0" w:color="000000"/>
+              <w:right w:val="single" w:sz="4" w:space="0" w:color="000000"/>
+            </w:tcBorders>
+          </w:tcPr>
+          <w:p>
+            <w:pPr>
+              <w:widowControl w:val="0"/>
+              <w:tabs>
+                <w:tab w:val="left" w:pos="993"/>
+              </w:tabs>
+              <w:autoSpaceDE w:val="0"/>
+              <w:autoSpaceDN w:val="0"/>
+              <w:adjustRightInd w:val="0"/>
+              <w:spacing w:before="0" w:line="240" w:lineRule="auto"/>
+              <w:ind w:right="297"/>
+              <w:rPr>
+                <w:rFonts w:cs="Arial"/>
+                <w:b/>
+                <w:sz w:val="28"/>
+                <w:szCs w:val="32"/>
                 <w:lang w:bidi="ta-IN"/>
               </w:rPr>
             </w:pPr>
@@ -4164,6 +4594,7 @@
                 <w:szCs w:val="32"/>
                 <w:lang w:bidi="ta-IN"/>
               </w:rPr>
+              <w:lastRenderedPageBreak/>
               <w:t>T.S.2.5.11.9 Kramam</w:t>
             </w:r>
           </w:p>
@@ -4469,7 +4900,6 @@
                 <w:szCs w:val="32"/>
                 <w:lang w:bidi="ta-IN"/>
               </w:rPr>
-              <w:lastRenderedPageBreak/>
               <w:t>T.S.2.5.11.9 Kramam</w:t>
             </w:r>
           </w:p>
@@ -6073,7 +6503,6 @@
           <w:szCs w:val="32"/>
           <w:u w:val="single"/>
         </w:rPr>
-        <w:lastRenderedPageBreak/>
         <w:t xml:space="preserve">TS </w:t>
       </w:r>
       <w:r>
@@ -7905,6 +8334,7 @@
                 <w:sz w:val="28"/>
                 <w:szCs w:val="32"/>
               </w:rPr>
+              <w:lastRenderedPageBreak/>
               <w:t>T.S.2.</w:t>
             </w:r>
             <w:r>
@@ -8476,7 +8906,6 @@
                 <w:sz w:val="28"/>
                 <w:szCs w:val="32"/>
               </w:rPr>
-              <w:lastRenderedPageBreak/>
               <w:t>T.S.2.</w:t>
             </w:r>
             <w:r>
@@ -10809,6 +11238,7 @@
                 <w:sz w:val="28"/>
                 <w:szCs w:val="32"/>
               </w:rPr>
+              <w:lastRenderedPageBreak/>
               <w:t>T.S.2.</w:t>
             </w:r>
             <w:r>
@@ -11262,7 +11692,6 @@
                 <w:sz w:val="28"/>
                 <w:szCs w:val="32"/>
               </w:rPr>
-              <w:lastRenderedPageBreak/>
               <w:t>T.S.2.</w:t>
             </w:r>
             <w:r>
@@ -12785,7 +13214,16 @@
           <w:bCs/>
           <w:sz w:val="32"/>
         </w:rPr>
-        <w:t>replaced with</w:t>
+        <w:t xml:space="preserve">replaced </w:t>
+      </w:r>
+      <w:proofErr w:type="gramStart"/>
+      <w:r>
+        <w:rPr>
+          <w:b/>
+          <w:bCs/>
+          <w:sz w:val="32"/>
+        </w:rPr>
+        <w:t>with</w:t>
       </w:r>
       <w:r>
         <w:rPr>
@@ -12805,7 +13243,29 @@
           <w:szCs w:val="40"/>
           <w:lang w:val="en-IN" w:eastAsia="en-IN"/>
         </w:rPr>
-        <w:t xml:space="preserve">"q§T"  </w:t>
+        <w:t>"</w:t>
+      </w:r>
+      <w:proofErr w:type="gramEnd"/>
+      <w:r>
+        <w:rPr>
+          <w:rFonts w:ascii="BRH Malayalam" w:hAnsi="BRH Malayalam" w:cs="BRH Malayalam"/>
+          <w:color w:val="000000"/>
+          <w:sz w:val="40"/>
+          <w:szCs w:val="40"/>
+          <w:lang w:val="en-IN" w:eastAsia="en-IN"/>
+        </w:rPr>
+        <w:t>q§T</w:t>
+      </w:r>
+      <w:proofErr w:type="gramStart"/>
+      <w:r>
+        <w:rPr>
+          <w:rFonts w:ascii="BRH Malayalam" w:hAnsi="BRH Malayalam" w:cs="BRH Malayalam"/>
+          <w:color w:val="000000"/>
+          <w:sz w:val="40"/>
+          <w:szCs w:val="40"/>
+          <w:lang w:val="en-IN" w:eastAsia="en-IN"/>
+        </w:rPr>
+        <w:t xml:space="preserve">"  </w:t>
       </w:r>
       <w:r>
         <w:rPr>
@@ -12813,7 +13273,16 @@
           <w:bCs/>
           <w:sz w:val="32"/>
         </w:rPr>
-        <w:t>wherever applicable</w:t>
+        <w:t>wherever</w:t>
+      </w:r>
+      <w:proofErr w:type="gramEnd"/>
+      <w:r>
+        <w:rPr>
+          <w:b/>
+          <w:bCs/>
+          <w:sz w:val="32"/>
+        </w:rPr>
+        <w:t xml:space="preserve"> applicable</w:t>
       </w:r>
     </w:p>
     <w:p>
@@ -13017,6 +13486,7 @@
                 <w:sz w:val="28"/>
                 <w:szCs w:val="32"/>
               </w:rPr>
+              <w:lastRenderedPageBreak/>
               <w:t>None</w:t>
             </w:r>
           </w:p>

</xml_diff>